<commit_message>
Contenido completo v3.2 en un documento y prompt de reescritura actualizado
Co-Authored-By: Claude Opus 5.5 <noreply@anthropic.com>
Claude-Session: https://claude.ai/code/session_01P5F6YBSbmgYFHyY7RUeBgK
</commit_message>
<xml_diff>
--- a/proyecto-inclusion-financiera/manual/Prompt_reescritura_lecciones.docx
+++ b/proyecto-inclusion-financiera/manual/Prompt_reescritura_lecciones.docx
@@ -19,7 +19,7 @@
           <w:sz w:val="52"/>
           <w:szCs w:val="52"/>
         </w:rPr>
-        <w:t xml:space="preserve">Prompt para reescribir las lecciones</w:t>
+        <w:t xml:space="preserve">Tu Dinero, Tu Familia, Tu Futuro</w:t>
       </w:r>
     </w:p>
     <w:p>
@@ -32,7 +32,7 @@
           <w:sz w:val="28"/>
           <w:szCs w:val="28"/>
         </w:rPr>
-        <w:t xml:space="preserve">Tu Dinero, Tu Familia, Tu Futuro · Formato de 5 y 10 minutos</w:t>
+        <w:t xml:space="preserve">Prompt de reescritura de lecciones · Versión 3.2 · Septiembre de 2026</w:t>
       </w:r>
     </w:p>
     <w:p>
@@ -173,7 +173,7 @@
     </w:p>
     <w:p>
       <w:r>
-        <w:t xml:space="preserve">objetivo: Una frase: qué podrá hacer la persona al terminar. gancho: 3 a 4 frases con Alex o Mar que presentan el problema de la lección.</w:t>
+        <w:t xml:space="preserve">objetivo: Una frase: qué podrá hacer la persona al terminar. gancho: 3 a 4 frases con uno de los personajes del módulo que presentan el problema de la lección.</w:t>
       </w:r>
     </w:p>
     <w:p>
@@ -590,10 +590,10 @@
           <w:b/>
           <w:bCs/>
         </w:rPr>
-        <w:t xml:space="preserve">Nombre de la actividad (tipo H5P):</w:t>
-      </w:r>
-      <w:r>
-        <w:t xml:space="preserve"> qué hace la persona. (Conserva la actividad original.)</w:t>
+        <w:t xml:space="preserve">¿Qué harías? (H5P):</w:t>
+      </w:r>
+      <w:r>
+        <w:t xml:space="preserve"> tres situaciones de esta lección con [personajes de los casos]. Elige la mejor decisión en cada una; si fallas, puedes intentarlo de nuevo. Suma puntos de experiencia.</w:t>
       </w:r>
     </w:p>
     <w:p>
@@ -723,6 +723,11 @@
       </w:r>
     </w:p>
     <w:p>
+      <w:r>
+        <w:t xml:space="preserve">Se cuentan palabras visibles (sin las definiciones de los términos). A 90–110 palabras por minuto:</w:t>
+      </w:r>
+    </w:p>
+    <w:p>
       <w:pPr>
         <w:pStyle w:val="ListParagraph"/>
         <w:numPr>
@@ -738,26 +743,26 @@
         <w:t xml:space="preserve">Lo esencial = 5 minutos:</w:t>
       </w:r>
       <w:r>
-        <w:t xml:space="preserve"> 500 a 600 palabras, en 5 a 7 bloques, más "comprueba" (2 preguntas) y "recuerda" (3 puntos). Debe bastar por sí solo para actuar.</w:t>
-      </w:r>
-    </w:p>
-    <w:p>
-      <w:pPr>
-        <w:pStyle w:val="ListParagraph"/>
-        <w:numPr>
-          <w:ilvl w:val="0"/>
-          <w:numId w:val="2"/>
-        </w:numPr>
-      </w:pPr>
-      <w:r>
-        <w:rPr>
-          <w:b/>
-          <w:bCs/>
-        </w:rPr>
-        <w:t xml:space="preserve">Profundiza = 5 minutos más:</w:t>
-      </w:r>
-      <w:r>
-        <w:t xml:space="preserve"> 550 a 700 palabras, más 3 casos y 4 errores frecuentes. No repite lo esencial: lo amplía con datos, ejemplos y matices.</w:t>
+        <w:t xml:space="preserve"> 350 a 500 palabras, en 5 a 7 bloques, más "comprueba" (2 preguntas) y "recuerda" (3 puntos). Debe bastar por sí solo para actuar.</w:t>
+      </w:r>
+    </w:p>
+    <w:p>
+      <w:pPr>
+        <w:pStyle w:val="ListParagraph"/>
+        <w:numPr>
+          <w:ilvl w:val="0"/>
+          <w:numId w:val="2"/>
+        </w:numPr>
+      </w:pPr>
+      <w:r>
+        <w:rPr>
+          <w:b/>
+          <w:bCs/>
+        </w:rPr>
+        <w:t xml:space="preserve">Lección completa = 10 minutos:</w:t>
+      </w:r>
+      <w:r>
+        <w:t xml:space="preserve"> 800 a 1,200 palabras. Profundiza lleva 3 casos y 4 errores frecuentes. No repite lo esencial: lo amplía con datos, ejemplos y matices.</w:t>
       </w:r>
     </w:p>
     <w:p>
@@ -862,7 +867,43 @@
         </w:numPr>
       </w:pPr>
       <w:r>
-        <w:t xml:space="preserve">Números con ejemplo concreto. Usa a Alex y Mar en los casos.</w:t>
+        <w:t xml:space="preserve">Números con ejemplo concreto.</w:t>
+      </w:r>
+    </w:p>
+    <w:p>
+      <w:pPr>
+        <w:pStyle w:val="ListParagraph"/>
+        <w:numPr>
+          <w:ilvl w:val="0"/>
+          <w:numId w:val="2"/>
+        </w:numPr>
+      </w:pPr>
+      <w:r>
+        <w:t xml:space="preserve">Usa a los personajes del módulo (ver `manual/personajes.md`): M1 Alex y Mar, Luis y Daniela; M2 Luis, Daniela, Alex y Mar; M3 Luis, Andrés, Mar y Daniela; M4 Rosa, Daniela, Alex y Mar; M5 Andrés, Rosa, Daniela y Luis.</w:t>
+      </w:r>
+    </w:p>
+    <w:p>
+      <w:pPr>
+        <w:pStyle w:val="ListParagraph"/>
+        <w:numPr>
+          <w:ilvl w:val="0"/>
+          <w:numId w:val="2"/>
+        </w:numPr>
+      </w:pPr>
+      <w:r>
+        <w:t xml:space="preserve">Nunca digas la situación migratoria de un personaje. Si el tema lo pide, usa "sin residencia legal", "sin permiso para trabajar" o "sin visa de trabajo"; nunca "ilegal" ni "sin papeles".</w:t>
+      </w:r>
+    </w:p>
+    <w:p>
+      <w:pPr>
+        <w:pStyle w:val="ListParagraph"/>
+        <w:numPr>
+          <w:ilvl w:val="0"/>
+          <w:numId w:val="2"/>
+        </w:numPr>
+      </w:pPr>
+      <w:r>
+        <w:t xml:space="preserve">Del trabajo de Mar di solo lo necesario: le pagan cada semana, recibe la mayor parte de sus propinas en efectivo, a veces le pagan por app y algunos fines de semana vende comida por encargo.</w:t>
       </w:r>
     </w:p>
     <w:p>
@@ -1185,19 +1226,17 @@
         </w:numPr>
       </w:pPr>
       <w:r>
-        <w:t xml:space="preserve">la actividad H5P;</w:t>
-      </w:r>
-    </w:p>
-    <w:p>
-      <w:pPr>
-        <w:pStyle w:val="ListParagraph"/>
-        <w:numPr>
-          <w:ilvl w:val="0"/>
-          <w:numId w:val="2"/>
-        </w:numPr>
-      </w:pPr>
-      <w:r>
-        <w:t xml:space="preserve">las 3 preguntas del quiz, con sus respuestas;</w:t>
+        <w:t xml:space="preserve">las 3 preguntas del quiz, con sus respuestas. Cada pregunta lleva </w:t>
+      </w:r>
+      <w:r>
+        <w:rPr>
+          <w:b/>
+          <w:bCs/>
+        </w:rPr>
+        <w:t xml:space="preserve">tres opciones</w:t>
+      </w:r>
+      <w:r>
+        <w:t xml:space="preserve"> (a, b, c) de largo parecido: la correcta no debe ser siempre la más larga;</w:t>
       </w:r>
     </w:p>
     <w:p>
@@ -1246,7 +1285,7 @@
         </w:numPr>
       </w:pPr>
       <w:r>
-        <w:t xml:space="preserve">Lo esencial tiene de 500 a 600 palabras y profundiza de 550 a 700. Indica el conteo al final de cada lección, en un comentario HTML: `&lt;!-- esencial: N palabras · profundiza: N palabras --&gt;`.</w:t>
+        <w:t xml:space="preserve">Lo esencial tiene de 350 a 500 palabras visibles y la lección completa de 800 a 1,200. Indica el conteo al final de cada lección, en un comentario HTML: `&lt;!-- esencial: N palabras · profundiza: N palabras --&gt;`.</w:t>
       </w:r>
     </w:p>
     <w:p>
@@ -1295,6 +1334,18 @@
       </w:pPr>
       <w:r>
         <w:t xml:space="preserve">La sintaxis es exactamente la del formato (`---`, `==`, `||`, `|`, `{{ | }}`).</w:t>
+      </w:r>
+    </w:p>
+    <w:p>
+      <w:pPr>
+        <w:pStyle w:val="ListParagraph"/>
+        <w:numPr>
+          <w:ilvl w:val="0"/>
+          <w:numId w:val="6"/>
+        </w:numPr>
+      </w:pPr>
+      <w:r>
+        <w:t xml:space="preserve">Para la actividad H5P, entrega por cada caso una respuesta correcta y dos incorrectas convincentes, de largo parecido (formato de `herramientas/datos_casos.py`).</w:t>
       </w:r>
     </w:p>
     <w:p>

</xml_diff>